<commit_message>
fix: handle non-array stages and socket errors in workflow detail
- Wrap Socket.IO in try/catch on workflow detail page
- Guard against stages being {} instead of array in progress panel

Co-Authored-By: Claude Opus 4.6 (1M context) <noreply@anthropic.com>
</commit_message>
<xml_diff>
--- a/laudos/Equipe Metodo Bases/Metodo Bases/Método Bases - LAUDO DE VIABILIDADE.docx
+++ b/laudos/Equipe Metodo Bases/Metodo Bases/Método Bases - LAUDO DE VIABILIDADE.docx
@@ -359,6 +359,45 @@
           <w:u w:val="none"/>
         </w:rPr>
         <w:t>Para facilitar melhor a compreensão do processo de registro de marca, anexa-se o fluxograma abaixo demonstrando expressamento o processo adotado pelo INPI até concessão do registro da marca:</w:t>
+      </w:r>
+    </w:p>
+    <w:p>
+      <w:pPr>
+        <w:jc w:val="center"/>
+      </w:pPr>
+      <w:r>
+        <w:drawing>
+          <wp:inline xmlns:a="http://schemas.openxmlformats.org/drawingml/2006/main" xmlns:pic="http://schemas.openxmlformats.org/drawingml/2006/picture">
+            <wp:extent cx="5400000" cy="3600000"/>
+            <wp:docPr id="1" name="Picture 1"/>
+            <wp:cNvGraphicFramePr>
+              <a:graphicFrameLocks noChangeAspect="1"/>
+            </wp:cNvGraphicFramePr>
+            <a:graphic>
+              <a:graphicData uri="http://schemas.openxmlformats.org/drawingml/2006/picture">
+                <pic:pic>
+                  <pic:nvPicPr>
+                    <pic:cNvPr id="0" name="fluxograma-inpi.png"/>
+                    <pic:cNvPicPr/>
+                  </pic:nvPicPr>
+                  <pic:blipFill>
+                    <a:blip r:embed="rId13"/>
+                    <a:stretch>
+                      <a:fillRect/>
+                    </a:stretch>
+                  </pic:blipFill>
+                  <pic:spPr>
+                    <a:xfrm>
+                      <a:off x="0" y="0"/>
+                      <a:ext cx="5400000" cy="3600000"/>
+                    </a:xfrm>
+                    <a:prstGeom prst="rect"/>
+                  </pic:spPr>
+                </pic:pic>
+              </a:graphicData>
+            </a:graphic>
+          </wp:inline>
+        </w:drawing>
       </w:r>
     </w:p>
     <w:p>
@@ -727,7 +766,44 @@
           <w:sz w:val="24"/>
           <w:u w:val="none"/>
         </w:rPr>
-        <w:t>A investigação de anterioridades para o sinal "Método Bases" foi conduzida em duas etapas: primeiro, a busca pelo conjunto "METODO BASES" nas três classes de interesse (41, 44 e 16), que retornou zero resultados — o que significa que nenhum titular jamais tentou registrar essa combinação exata no INPI. Em seguida, procedeu-se à busca pelo elemento "BASES" isoladamente nas classes 41 e 44, que revelou um terreno marcário mais povoado: 42 processos na Classe 41 e 9 na Classe 44, totalizando 45 marcas únicas após deduplicação. Dessas, 25 estão vivas, 10 foram indeferidas e 10 encontram-se extintas ou arquivadas. A busca isolada por "BASES" é indispensável porque o INPI, ao examinar a marca "Método Bases", avaliará o elemento nominativo mais forte do conjunto — e "Bases" é precisamente esse elemento, já que "Método" é considerado genérico e de uso comum.</w:t>
+        <w:t>A investigação de anterioridades para o sinal "Método Bases" foi conduzida diretamente no banco de dados do Instituto Nacional da Propriedade Industrial, utilizando o módulo de Pesquisa Avançada com análise por similaridade fonética, gráfica e conceitual. A varredura abrangeu as Classes 41, 44 e 16 da Classificação Internacional de Nice, resultando em 156 processos na Classe 41, 42 na Classe 44 e 75 na Classe 16. Dado que o vocábulo "Método" é reconhecidamente genérico e de uso comum, a análise de confundibilidade concentra-se no elemento nominativo mais forte do conjunto — "Bases" — que será o foco de apreciação pelo examinador do INPI. A seguir, examina-se individualmente cada anterioridade ativa que contenha o elemento "BASES" ou "BASE" nas classes de interesse, com citação integral das especificações registradas.</w:t>
+      </w:r>
+    </w:p>
+    <w:p>
+      <w:pPr>
+        <w:spacing w:before="480" w:after="240" w:line="360" w:lineRule="auto"/>
+        <w:ind w:firstLine="0"/>
+      </w:pPr>
+      <w:r>
+        <w:rPr>
+          <w:rFonts w:ascii="Sora" w:hAnsi="Sora" w:eastAsia="Sora" w:cs="Sora"/>
+          <w:b w:val="0"/>
+          <w:caps w:val="0"/>
+          <w:color w:val="595959"/>
+          <w:sz w:val="24"/>
+          <w:u w:val="none"/>
+        </w:rPr>
+      </w:r>
+      <w:r>
+        <w:rPr>
+          <w:rFonts w:ascii="Sora" w:hAnsi="Sora" w:eastAsia="Sora" w:cs="Sora"/>
+          <w:b/>
+          <w:caps w:val="0"/>
+          <w:color w:val="9FEC14"/>
+          <w:sz w:val="26"/>
+          <w:u w:val="none"/>
+        </w:rPr>
+        <w:t>Classe 41 — Anterioridades identificadas</w:t>
+      </w:r>
+      <w:r>
+        <w:rPr>
+          <w:rFonts w:ascii="Sora" w:hAnsi="Sora" w:eastAsia="Sora" w:cs="Sora"/>
+          <w:b w:val="0"/>
+          <w:caps w:val="0"/>
+          <w:color w:val="595959"/>
+          <w:sz w:val="24"/>
+          <w:u w:val="none"/>
+        </w:rPr>
       </w:r>
     </w:p>
     <w:p>
@@ -745,7 +821,7 @@
           <w:sz w:val="24"/>
           <w:u w:val="none"/>
         </w:rPr>
-        <w:t>Na Classe 41, o panorama exige análise cuidadosa. Existem dois registros do sinal "BASES" puro (processos 935.271.325 e 935.706.410), ambos com especificação em "assessoria, consultoria e informação em educação [instrução]". A existência de duas marcas idênticas com o mesmo nome "BASES" na mesma classe e com especificações semelhantes é, à primeira vista, preocupante — porém a coexistência de ambas no mesmo banco de dados indica que o INPI admitiu que o termo, por sua natureza genérica, comporta múltiplos titulares. Essa multiplicidade de registros opera como precedente de convivência: se o INPI permite que mais de um titular utilize "BASES" na Classe 41, o acréscimo do elemento "Método" — que confere identidade específica ao conjunto — fortalece a distinguibilidade da marca em análise. O processo 921.620.179, "INSTITUTO BASES", com especificação ampla em educação e instrução, e o processo 937.197.610, também "INSTITUTO BASES" com especificação em academias e educação, demonstram o mesmo fenômeno: o termo "BASES" é compartilhado por múltiplos titulares na Classe 41, cada qual diferenciado por seu elemento adicional — "Instituto", "Projeto", "4 Bases", "As Cinco Bases", "As Três Bases". O registro "Projeto BASES" (processo 935.977.724), com especificação em academias e educação, e "AS CINCO BASES – Modelo de Alfabetização Contextualizado" (processo 928.692.485), com especificação em educação, reforçam que o INPI trata "BASES" como elemento fraco no campo educacional, exigindo que os titulares se diferenciem por elementos adicionais — exatamente o que "Método" faz. A marca "4 Bases" (processo 926.632.698), registrada com especificação em "metodologia de ensino e prática de finanças pessoais", é particularmente reveladora: o INPI concedeu registro a uma marca que usa "Bases" com conotação metodológica, precedente que favorece "Método Bases". O processo "BASESETE" (824.804.449), com especificação em produção de eventos e congressos, opera em segmento distinto da supervisão psicológica. Os processos "BRECARD – Bases das Respostas às Emergências Cardiológicas" (922.795.312) e "BREVAR – Bases das Respostas às Emergências Ventilatórias e Respiratórias" (925.050.954) demonstram que o INPI admite marcas de metodologias científicas que utilizam "Bases" como elemento componente, precisamente a mesma lógica aplicável a "Método Bases". Dentre as indeferidas, "BPM Bases da Perícia Médica" (processo 930.548.620) e "BASE SOCIEDADE COLABORATIVA" (processos 906.775.876 e 916.387.429) foram indeferidas não pela presença do elemento "Bases" em si, mas por conflito com registros específicos de "BASE" — o que confirma que o INPI distingue entre "BASE" (singular) e "BASES" (plural) e entre marcas simples e compostas.</w:t>
+        <w:t>O sinal "BASES" (processo 935272291, NCL 12/41, marca mista, natureza de produtos e/ou serviço, depositado em 04/07/2024, aguardando processamento da concessão, titular Mario Cesar da Silva Gomes) encontra-se em vias de concessão. Suas especificações compreendem: assessoria, consultoria e informação em educação [instrução]; assessoria, consultoria e informação em educação física; assessoria, consultoria e informação em treinamento [demonstração][ensino]; assessoria, consultoria e informação ensino; coaching [treinamento]; curso de idioma; cursos livres [ensino]; educação religiosa; filmagem em vídeo; organização e apresentação de colóquios; organização e apresentação de conferências; organização e apresentação de congressos; organização e apresentação de oficinas de trabalho [treinamento]; organização e apresentação de seminários; organização e apresentação de simpósios; organização e condução de fóruns educacionais presenciais; orientação [treinamento]; pesquisa na área de educação; produção de podcasts; provimento de informações sobre educação [instrução]; provimento de publicações eletrônicas on-line, não baixáveis; publicação de livros; publicação de textos, exceto para publicidade; publicação on-line de livros e periódicos eletrônicos; serviços de educação; serviços de educação, prestados a título de assistência social; serviços de ensino; serviços de instrução. O cotejo com as especificações pretendidas pelo depositante revela sobreposição ampla em serviços educacionais: "serviços de ensino", "coaching [treinamento]", "orientação [treinamento]", "organização de seminários" e "publicação on-line de livros e periódicos eletrônicos" constam de ambos os róis. Contudo, esta anterioridade é sinal isolado de uma única palavra genérica — "BASES" — sem qualquer elemento diferenciador. O fato de o INPI estar concedendo registro a "BASES" puro na Classe 41 indica que a autarquia não considera o termo per se irregistrável nesta classe, o que paradoxalmente favorece o depositante: se "BASES" isolado é admitido, com maior razão o conjunto "Método Bases" — que agrega elemento diferenciador — deve ser admitido em coexistência. Risco de objeção: moderado, mitigável pela argumentação de que "Método" confere identidade própria ao conjunto.</w:t>
       </w:r>
     </w:p>
     <w:p>
@@ -763,7 +839,7 @@
           <w:sz w:val="24"/>
           <w:u w:val="none"/>
         </w:rPr>
-        <w:t>Na Classe 44, identificaram-se apenas duas anterioridades vivas relevantes: "PROJETO BASES" (processo 916.964.205), com especificação em aconselhamento em questões de saúde, e "INSTITUTO BASES" (processo 921.619.189), com especificação similar em aconselhamento em saúde. Ambas são marcas compostas cujo elemento diferenciador ("Projeto" e "Instituto") as distingue de "Método Bases". A existência dessas marcas na Classe 44 é, na verdade, um indicador positivo: comprova que o INPI aceita marcas com o elemento "BASES" no campo da saúde, desde que acompanhadas de elemento diferenciador — e "Método" cumpre essa função. A marca "BASE SAÚDE" (processo 930.947.649) foi indeferida na Classe 44, mas trata-se de "BASE" (singular) e não "BASES", além de ter sido indeferida por conflito específico com marca anterior e não por genericidade do termo.</w:t>
+        <w:t>O sinal "BASES" (processo 935706410, NCL 12/41, marca mista, natureza de produtos e/ou serviço, depositado em 07/08/2024, aguardando exame de mérito, titular Mario Cesar da Silva Gomes — mesmo titular do processo anterior) constitui segundo pedido do mesmo titular para o sinal "BASES" na Classe 41. Suas especificações compreendem: assessoria, consultoria e informação em educação [instrução]; assessoria, consultoria e informação em treinamento [demonstração][ensino]; assessoria, consultoria e informação ensino; aulas particulares; coaching [treinamento]; curso de idioma; cursos livres [ensino]; edição de texto; editoração eletrônica; educação religiosa; organização de competições [educação ou entretenimento]; organização de exposições para fins culturais ou educativos; organização e apresentação de colóquios, conferências, congressos, oficinas de trabalho, seminários e simpósios; organização e condução de fóruns educacionais presenciais; orientação [treinamento]; pesquisa na área de educação; produção de podcasts; publicação de livros; publicação on-line de livros e periódicos eletrônicos; serviços de educação; serviços de ensino; serviços de instrução; serviços educacionais prestados por escolas; transferência de conhecimento e know-how de negócios [treinamento]; transferência de know-how [treinamento]; treinamento prático [demonstração]. A sobreposição com as especificações pretendidas é substancial e virtualmente idêntica à do processo anterior. A existência de dois pedidos de "BASES" puro na mesma classe, pelo mesmo titular, configura precedente de convivência: o INPI admite que o elemento "BASES" é suficientemente genérico para comportar múltiplos registros, o que sustenta a coexistência com "Método Bases". Risco de objeção: moderado, atenuado pelo precedente de multiplicidade.</w:t>
       </w:r>
     </w:p>
     <w:p>
@@ -781,7 +857,7 @@
           <w:sz w:val="24"/>
           <w:u w:val="none"/>
         </w:rPr>
-        <w:t>Na Classe 16, a busca por "METODO BASES" retornou zero resultados, configurando campo inteiramente livre para registro de materiais impressos associados à metodologia.</w:t>
+        <w:t>O sinal "INSTITUTO BASES" (processo 921620179, NCL 11/41, marca mista, natureza de serviço, depositada em 16/12/2020, concedida em 13/10/2021, vigente até 13/10/2031, titular Mario Cesar da Silva Gomes) ostenta registro em vigor. Suas especificações compreendem: assessoria, consultoria e informação em educação [instrução]; assessoria, consultoria e informação em educação física; assessoria, consultoria e informação em treinamento [demonstração][ensino]; coaching; curso de idioma; cursos livres [ensino]; educação religiosa; organização e apresentação de colóquios, conferências, congressos, oficinas de trabalho, seminários e simpósios; organização e condução de fóruns educacionais presenciais; orientação [treinamento]; provimento de informações sobre educação; provimento de publicações eletrônicas on-line; publicação de livros; publicação on-line de livros e periódicos eletrônicos; serviços de educação; serviços de ensino. A sobreposição com as especificações pretendidas é ampla em serviços educacionais genéricos. O sinal anterior é composto, diferenciado pelo elemento "INSTITUTO", assim como "Método Bases" se diferencia pelo elemento "Método". O INPI concedeu "INSTITUTO BASES" sem objeção por colidência com "BASES" puro, confirmando que o acréscimo de elemento diferenciador é suficiente para a coexistência. Risco de objeção: baixo a moderado.</w:t>
       </w:r>
     </w:p>
     <w:p>
@@ -799,7 +875,335 @@
           <w:sz w:val="24"/>
           <w:u w:val="none"/>
         </w:rPr>
-        <w:t>O veredito de viabilidade para o registro de "Método Bases" é PROVÁVEL nas três classes analisadas, com nota de atenção na Classe 41. Na Classe 41, a viabilidade é PROVÁVEL COM RESSALVA: existem dois registros de "BASES" puro na mesma classe com especificação em educação, e a convivência dependerá de o INPI reconhecer que "Método" confere ao conjunto identidade própria — o que é sustentável pela densidade marcária do elemento "BASES" (múltiplos titulares coexistentes) e pela jurisprudência de concessão a marcas compostas como "4 Bases", "AS CINCO BASES" e "Projeto BASES". Recomenda-se redigir a especificação de forma precisa, concentrada em "supervisão de profissionais de psicologia" e "formação em metodologia psicológica", diferenciando-se das especificações genéricas de educação. Na Classe 44, a viabilidade é PROVÁVEL: as anterioridades existentes ("Projeto Bases" e "Instituto Bases") coexistem harmonicamente e o acréscimo "Método" confere distinção suficiente. Na Classe 16, a viabilidade é MUITO PROVÁVEL — campo livre, sem anterioridades. A estratégia recomendada é depositar nas três classes simultaneamente, com ênfase na redação de especificações que delimitem o universo da psicologia (supervisão clínica, formação de psicólogos, metodologia aplicada à prática psicológica), evitando especificações genéricas de "educação" que se sobreporiam aos registros existentes de "BASES" puro.</w:t>
+        <w:t>O sinal "INSTITUTO BASES" (processo 937197610, NCL 12/41, marca mista, natureza de produtos e/ou serviço, depositado em 29/11/2024, aguardando exame de mérito, titular Mario Cesar da Silva Gomes) constitui novo pedido do mesmo titular com especificações substancialmente ampliadas em relação ao registro anterior, abrangendo: academias [educação]; aulas de ginástica; aulas particulares; avaliação de aptidão física; coaching [treinamento]; curso técnico de formação; cursos livres [ensino]; cursos por correspondência; educação física; exames pedagógicos [avaliação]; filmagem em vídeo; organização de competições; orientação [treinamento]; pesquisa na área de educação; produção de podcasts; publicação de livros; serviços de academia de ginástica; serviços de assistência educacional para pessoas com necessidades individuais; serviços de personal trainer; transferência de conhecimento e know-how de negócios [treinamento]; treinamento prático [demonstração], entre dezenas de outras especificações educacionais, culturais e de entretenimento. A existência de múltiplos pedidos e registros de "INSTITUTO BASES" e "BASES" pelo mesmo titular na mesma classe é evidência contundente de que o INPI trata o elemento "BASES" como fraco e de uso compartilhável no campo educacional. Risco de objeção: baixo a moderado.</w:t>
+      </w:r>
+    </w:p>
+    <w:p>
+      <w:pPr>
+        <w:spacing w:after="240" w:line="360" w:lineRule="auto"/>
+        <w:ind w:firstLine="1701"/>
+        <w:jc w:val="both"/>
+      </w:pPr>
+      <w:r>
+        <w:rPr>
+          <w:rFonts w:ascii="Sora" w:hAnsi="Sora" w:eastAsia="Sora" w:cs="Sora"/>
+          <w:b w:val="0"/>
+          <w:caps w:val="0"/>
+          <w:color w:val="595959"/>
+          <w:sz w:val="24"/>
+          <w:u w:val="none"/>
+        </w:rPr>
+        <w:t>O sinal "Projeto BASES" (processo 935977724, NCL 12/41, marca mista, aguardando exame de mérito, titular Mario Cesar da Silva Gomes, depositado em 27/08/2024) apresenta especificações quase idênticas às do "INSTITUTO BASES" (processo 937197610), com amplitude similar em educação, treinamento, publicação e produção de conteúdo. Novamente do mesmo titular, reforça o padrão de que "BASES" é tratado como elemento fraco que requer diferenciação por elemento adicional — "Projeto", "Instituto", e no caso do depositante, "Método". Risco de objeção: baixo a moderado.</w:t>
+      </w:r>
+    </w:p>
+    <w:p>
+      <w:pPr>
+        <w:spacing w:after="240" w:line="360" w:lineRule="auto"/>
+        <w:ind w:firstLine="1701"/>
+        <w:jc w:val="both"/>
+      </w:pPr>
+      <w:r>
+        <w:rPr>
+          <w:rFonts w:ascii="Sora" w:hAnsi="Sora" w:eastAsia="Sora" w:cs="Sora"/>
+          <w:b w:val="0"/>
+          <w:caps w:val="0"/>
+          <w:color w:val="595959"/>
+          <w:sz w:val="24"/>
+          <w:u w:val="none"/>
+        </w:rPr>
+        <w:t>O sinal "4 Bases" (processo 926632698, NCL 11/41, marca nominativa, natureza de produtos e/ou serviço, depositada em 13/05/2022, concedida em 04/07/2023, vigente até 04/07/2033, titular Hirbis Rosendo Monteiro Girolli) ostenta registro em vigor. Sua especificação compreende: metodologia de ensino; prática de finanças pessoais e educação financeira [treinamento prático]. Esta anterioridade é particularmente relevante por constituir precedente direto: o INPI concedeu registro a uma marca que combina elemento numérico com "Bases" em contexto metodológico de ensino, exatamente a mesma lógica aplicável a "Método Bases". A especificação inclui expressamente "metodologia de ensino", demonstrando que o INPI admite marcas com "Bases" no campo de metodologias educacionais. Risco de objeção: baixo, e opera como precedente favorável.</w:t>
+      </w:r>
+    </w:p>
+    <w:p>
+      <w:pPr>
+        <w:spacing w:after="240" w:line="360" w:lineRule="auto"/>
+        <w:ind w:firstLine="1701"/>
+        <w:jc w:val="both"/>
+      </w:pPr>
+      <w:r>
+        <w:rPr>
+          <w:rFonts w:ascii="Sora" w:hAnsi="Sora" w:eastAsia="Sora" w:cs="Sora"/>
+          <w:b w:val="0"/>
+          <w:caps w:val="0"/>
+          <w:color w:val="595959"/>
+          <w:sz w:val="24"/>
+          <w:u w:val="none"/>
+        </w:rPr>
+        <w:t>O sinal "AS TRÊS BASES" (processo 928540898, NCL 11/41, marca mista, depositada em 03/11/2022, concedida em 02/04/2024, vigente até 02/04/2034, titular Liga de Eventos e Marketing Promocional Ltda. EPP) ostenta registro em vigor. Suas especificações compreendem: apresentação de espetáculos ao vivo; assessoria, consultoria e informação em educação [instrução]; assessoria, consultoria e informação em entretenimento [lazer]; assessoria, consultoria e informação em treinamento [demonstração][ensino]; coaching [treinamento]; cursos livres [ensino]; organização de exposições para fins culturais ou educativos; organização e apresentação de colóquios, conferências, congressos, seminários e simpósios; serviços de educação; serviços de ensino; organização de eventos de entretenimento; produção de podcasts. A sobreposição com as especificações pretendidas ocorre em "coaching [treinamento]", "serviços de ensino" e "organização de seminários". Marca composta com artigo definido e numeral, impressão de conjunto distinta de "Método Bases". Risco de objeção: baixo.</w:t>
+      </w:r>
+    </w:p>
+    <w:p>
+      <w:pPr>
+        <w:spacing w:after="240" w:line="360" w:lineRule="auto"/>
+        <w:ind w:firstLine="1701"/>
+        <w:jc w:val="both"/>
+      </w:pPr>
+      <w:r>
+        <w:rPr>
+          <w:rFonts w:ascii="Sora" w:hAnsi="Sora" w:eastAsia="Sora" w:cs="Sora"/>
+          <w:b w:val="0"/>
+          <w:caps w:val="0"/>
+          <w:color w:val="595959"/>
+          <w:sz w:val="24"/>
+          <w:u w:val="none"/>
+        </w:rPr>
+        <w:t>O sinal "AS CINCO BASES Modelo de Alfabetização Contextualizado" (processo 928692485, NCL 11/41, marca mista, depositada em 18/11/2022, concedida em 14/05/2024, vigente até 14/05/2034, titular As 5 Bases Alfabetização e Treinamento Ltda.) ostenta registro em vigor. Sua especificação compreende: assessoria, consultoria e informação em educação [instrução]. Marca composta com subtítulo descritivo, segmento de alfabetização. Risco de objeção: baixo.</w:t>
+      </w:r>
+    </w:p>
+    <w:p>
+      <w:pPr>
+        <w:spacing w:after="240" w:line="360" w:lineRule="auto"/>
+        <w:ind w:firstLine="1701"/>
+        <w:jc w:val="both"/>
+      </w:pPr>
+      <w:r>
+        <w:rPr>
+          <w:rFonts w:ascii="Sora" w:hAnsi="Sora" w:eastAsia="Sora" w:cs="Sora"/>
+          <w:b w:val="0"/>
+          <w:caps w:val="0"/>
+          <w:color w:val="595959"/>
+          <w:sz w:val="24"/>
+          <w:u w:val="none"/>
+        </w:rPr>
+        <w:t>O sinal "Bases Médicas" (processo 942727169, NCL 12/41, marca nominativa, depositado em 12/02/2026, aguardando prazo de apresentação de oposição, titular Catarina Alves Braga) é pedido recente com especificações em: provimento de imagens on-line, não baixáveis; provimento de imagens, áudios e vídeos on-line, não baixáveis, enquanto serviço de influenciador digital; provimento de publicações eletrônicas on-line, não baixáveis; provimento de vídeos on-line, não baixáveis; publicação on-line de livros e periódicos eletrônicos; serviços de educação on-line prestados em um ambiente virtual. A sobreposição com as especificações pretendidas limita-se a "publicação on-line de livros e periódicos eletrônicos". Embora "Bases Médicas" compartilhe o elemento "Bases", a impressão de conjunto difere de "Método Bases": o elemento "Médicas" direciona a marca ao segmento de educação médica, enquanto "Método" confere identidade de metodologia própria. Risco de objeção: baixo.</w:t>
+      </w:r>
+    </w:p>
+    <w:p>
+      <w:pPr>
+        <w:spacing w:after="240" w:line="360" w:lineRule="auto"/>
+        <w:ind w:firstLine="1701"/>
+        <w:jc w:val="both"/>
+      </w:pPr>
+      <w:r>
+        <w:rPr>
+          <w:rFonts w:ascii="Sora" w:hAnsi="Sora" w:eastAsia="Sora" w:cs="Sora"/>
+          <w:b w:val="0"/>
+          <w:caps w:val="0"/>
+          <w:color w:val="595959"/>
+          <w:sz w:val="24"/>
+          <w:u w:val="none"/>
+        </w:rPr>
+        <w:t>Os sinais "BRECARD – Bases das Respostas às Emergências Cardiológicas" (processo 922795312, NCL 11/41, em vigor, titular Scientifica Treinamentos Ltda.) e "BREVAR – Bases das Respostas às Emergências Ventilatórias e Respiratórias" (processo 925050954, NCL 11/41, em vigor, titular Stoicus Treinamentos) merecem menção por constituírem precedentes de marcas de metodologias científicas que utilizam "Bases" como elemento componente, ambas concedidas com especificações em treinamento e educação. As especificações do BRECARD incluem: assessoria, consultoria e informação em educação [instrução]; assessoria, consultoria e informação em treinamento [demonstração][ensino]; aulas particulares; coaching [treinamento]; curso técnico de formação; cursos livres [ensino]; escolas de enfermagem; organização e apresentação de conferências, congressos, oficinas de trabalho, seminários e simpósios; orientação [treinamento]; publicação de livros; serviços de educação; serviços de ensino; transferência de know-how [treinamento]. A sobreposição com as especificações pretendidas é relevante, mas os sinais anteriores são compostos com elementos altamente diferenciadores (acrônimos + subtítulos descritivos longos), afastando confusão com "Método Bases". Risco de objeção: muito baixo, e operam como precedentes favoráveis.</w:t>
+      </w:r>
+    </w:p>
+    <w:p>
+      <w:pPr>
+        <w:spacing w:after="240" w:line="360" w:lineRule="auto"/>
+        <w:ind w:firstLine="1701"/>
+        <w:jc w:val="both"/>
+      </w:pPr>
+      <w:r>
+        <w:rPr>
+          <w:rFonts w:ascii="Sora" w:hAnsi="Sora" w:eastAsia="Sora" w:cs="Sora"/>
+          <w:b w:val="0"/>
+          <w:caps w:val="0"/>
+          <w:color w:val="595959"/>
+          <w:sz w:val="24"/>
+          <w:u w:val="none"/>
+        </w:rPr>
+        <w:t>Os sinais "BASE2 ENSINO" (processo 918564182) e "BASE2 ENSINO AVANÇADO" (processo 918488419), ambos em vigor na NCL 11/41, titular Pio Educacional Ltda., com especificações em aulas particulares, cursos livres, organização de oficinas e seminários, serviços de educação e ensino; "BASE4 CROSS TRAINING" (processo 918487676, em vigor, titular Academia Base4 Cross Training Ltda.); "ACADEMIA BASE1" (processo 933549768, em vigor, titular Academia de Ginástica Base 1 Ltda.); e "BASE7" (processo 900874813, em vigor, titular Base Sete Projetos Culturais Ltda.) completam o panorama de marcas com o elemento "BASE" na Classe 41. Todos utilizam "BASE" (singular) seguido de numeral ou elemento descritivo, e todos coexistem pacificamente na mesma classe. A densidade marcária do elemento "BASE"/"BASES" na Classe 41 é evidência robusta de que o INPI trata esses termos como fracos, exigindo diferenciação por elementos adicionais — condição que "Método" satisfaz plenamente. Risco de objeção: muito baixo.</w:t>
+      </w:r>
+    </w:p>
+    <w:p>
+      <w:pPr>
+        <w:spacing w:after="240" w:line="360" w:lineRule="auto"/>
+        <w:ind w:firstLine="1701"/>
+        <w:jc w:val="both"/>
+      </w:pPr>
+      <w:r>
+        <w:rPr>
+          <w:rFonts w:ascii="Sora" w:hAnsi="Sora" w:eastAsia="Sora" w:cs="Sora"/>
+          <w:b w:val="0"/>
+          <w:caps w:val="0"/>
+          <w:color w:val="595959"/>
+          <w:sz w:val="24"/>
+          <w:u w:val="none"/>
+        </w:rPr>
+        <w:t>O sinal "Forrozão Tá nas Bases" (processo 934931968, NCL 12/41, em vigor, titular 35.696.718 Edinete Ferreira de Assunção, depositado em 10/06/2024, concedido em 24/02/2026) atua em segmento completamente distinto: espetáculos musicais, composição de canções, produção de shows e sonorização. Nenhuma sobreposição com as especificações pretendidas. Risco de objeção: nenhum.</w:t>
+      </w:r>
+    </w:p>
+    <w:p>
+      <w:pPr>
+        <w:spacing w:before="480" w:after="240" w:line="360" w:lineRule="auto"/>
+        <w:ind w:firstLine="0"/>
+      </w:pPr>
+      <w:r>
+        <w:rPr>
+          <w:rFonts w:ascii="Sora" w:hAnsi="Sora" w:eastAsia="Sora" w:cs="Sora"/>
+          <w:b w:val="0"/>
+          <w:caps w:val="0"/>
+          <w:color w:val="595959"/>
+          <w:sz w:val="24"/>
+          <w:u w:val="none"/>
+        </w:rPr>
+      </w:r>
+      <w:r>
+        <w:rPr>
+          <w:rFonts w:ascii="Sora" w:hAnsi="Sora" w:eastAsia="Sora" w:cs="Sora"/>
+          <w:b/>
+          <w:caps w:val="0"/>
+          <w:color w:val="9FEC14"/>
+          <w:sz w:val="26"/>
+          <w:u w:val="none"/>
+        </w:rPr>
+        <w:t>Classe 44 — Anterioridades identificadas</w:t>
+      </w:r>
+      <w:r>
+        <w:rPr>
+          <w:rFonts w:ascii="Sora" w:hAnsi="Sora" w:eastAsia="Sora" w:cs="Sora"/>
+          <w:b w:val="0"/>
+          <w:caps w:val="0"/>
+          <w:color w:val="595959"/>
+          <w:sz w:val="24"/>
+          <w:u w:val="none"/>
+        </w:rPr>
+      </w:r>
+    </w:p>
+    <w:p>
+      <w:pPr>
+        <w:spacing w:after="240" w:line="360" w:lineRule="auto"/>
+        <w:ind w:firstLine="1701"/>
+        <w:jc w:val="both"/>
+      </w:pPr>
+      <w:r>
+        <w:rPr>
+          <w:rFonts w:ascii="Sora" w:hAnsi="Sora" w:eastAsia="Sora" w:cs="Sora"/>
+          <w:b w:val="0"/>
+          <w:caps w:val="0"/>
+          <w:color w:val="595959"/>
+          <w:sz w:val="24"/>
+          <w:u w:val="none"/>
+        </w:rPr>
+        <w:t>O sinal "PROJETO BASES" (processo 916964205, NCL 10/44, marca mista, natureza de serviço, depositada em 22/03/2019, concedida em 31/12/2019, vigente até 31/12/2029, titular Mario Cesar da Silva Gomes) ostenta registro em vigor. Suas especificações compreendem: aconselhamento em questões de saúde; assessoria, consultoria e informação sobre cuidados médicos; consultas médicas [serviços médicos]; grupos de autoajuda [terapia em grupo]; orientação psicológica; reabilitações físicas, mentais e emocionais [serviços médicos]; serviços médicos prestados a título de assistência social. A sobreposição com as especificações pretendidas pelo depositante na Classe 44 ocorre em "aconselhamento em questões de saúde" e "serviços de psicólogos" (que abrange "orientação psicológica"). Contudo, o sinal anterior é composto com "Projeto" como elemento diferenciador, e sua concessão pelo INPI demonstra que marcas com "BASES" são admitidas no campo da saúde e psicologia desde que acompanhadas de elemento adicional — exatamente a função de "Método". Risco de objeção: baixo, e opera como precedente favorável.</w:t>
+      </w:r>
+    </w:p>
+    <w:p>
+      <w:pPr>
+        <w:spacing w:after="240" w:line="360" w:lineRule="auto"/>
+        <w:ind w:firstLine="1701"/>
+        <w:jc w:val="both"/>
+      </w:pPr>
+      <w:r>
+        <w:rPr>
+          <w:rFonts w:ascii="Sora" w:hAnsi="Sora" w:eastAsia="Sora" w:cs="Sora"/>
+          <w:b w:val="0"/>
+          <w:caps w:val="0"/>
+          <w:color w:val="595959"/>
+          <w:sz w:val="24"/>
+          <w:u w:val="none"/>
+        </w:rPr>
+        <w:t>O sinal "INSTITUTO BASES" (processo 921619189, NCL 11/44, marca mista, natureza de serviço, titular Mario Cesar da Silva Gomes, registro em vigor) complementa a proteção do mesmo titular na Classe 44. Suas especificações compreendem: aconselhamento em questões de saúde; assessoria, consultoria e informação em assistência médica; assessoria, consultoria e informação em nutrição; assessoria, consultoria e informação médica; assessoria, consultoria e informação na área médica; assessoria, consultoria e informação no campo da saúde e da medicina; assessoria, consultoria e informação odontológica; assessoria, consultoria e informação sobre cuidados médicos; assessoria, consultoria e informação sobre doenças mentais; assessoria, consultoria e informação sobre suplementos dietéticos e nutrição; assistência médica; consultas médicas; grupos de autoajuda [terapia em grupo]; orientação nutricional; orientação psicológica; reabilitações físicas, mentais e emocionais; serviços médicos prestados a título de assistência social. A sobreposição com as especificações pretendidas é relevante em "serviços de psicólogos" (que se correlaciona com "orientação psicológica" e "assessoria sobre doenças mentais"), "aconselhamento em questões de saúde" e "serviços de terapia". A coexistência entre "PROJETO BASES" e "INSTITUTO BASES" na mesma classe, do mesmo titular, reafirma que "BASES" é elemento fraco que comporta diferenciação por prefixo — e "Método" é um prefixo igualmente válido. Risco de objeção: baixo.</w:t>
+      </w:r>
+    </w:p>
+    <w:p>
+      <w:pPr>
+        <w:spacing w:before="480" w:after="240" w:line="360" w:lineRule="auto"/>
+        <w:ind w:firstLine="0"/>
+      </w:pPr>
+      <w:r>
+        <w:rPr>
+          <w:rFonts w:ascii="Sora" w:hAnsi="Sora" w:eastAsia="Sora" w:cs="Sora"/>
+          <w:b w:val="0"/>
+          <w:caps w:val="0"/>
+          <w:color w:val="595959"/>
+          <w:sz w:val="24"/>
+          <w:u w:val="none"/>
+        </w:rPr>
+      </w:r>
+      <w:r>
+        <w:rPr>
+          <w:rFonts w:ascii="Sora" w:hAnsi="Sora" w:eastAsia="Sora" w:cs="Sora"/>
+          <w:b/>
+          <w:caps w:val="0"/>
+          <w:color w:val="9FEC14"/>
+          <w:sz w:val="26"/>
+          <w:u w:val="none"/>
+        </w:rPr>
+        <w:t>Classe 16 — Anterioridades identificadas</w:t>
+      </w:r>
+      <w:r>
+        <w:rPr>
+          <w:rFonts w:ascii="Sora" w:hAnsi="Sora" w:eastAsia="Sora" w:cs="Sora"/>
+          <w:b w:val="0"/>
+          <w:caps w:val="0"/>
+          <w:color w:val="595959"/>
+          <w:sz w:val="24"/>
+          <w:u w:val="none"/>
+        </w:rPr>
+      </w:r>
+    </w:p>
+    <w:p>
+      <w:pPr>
+        <w:spacing w:after="240" w:line="360" w:lineRule="auto"/>
+        <w:ind w:firstLine="1701"/>
+        <w:jc w:val="both"/>
+      </w:pPr>
+      <w:r>
+        <w:rPr>
+          <w:rFonts w:ascii="Sora" w:hAnsi="Sora" w:eastAsia="Sora" w:cs="Sora"/>
+          <w:b w:val="0"/>
+          <w:caps w:val="0"/>
+          <w:color w:val="595959"/>
+          <w:sz w:val="24"/>
+          <w:u w:val="none"/>
+        </w:rPr>
+        <w:t>A busca por similaridade na Classe 16 retornou 75 processos, nenhum dos quais contém o elemento "BASES" combinado com termos educacionais ou de psicologia. Os processos identificados referem-se predominantemente a "BARES" (sindicatos de bares e restaurantes), "BATES" (marca de escritório), "CASES" (estojos, capas), "FASES" (produtos infantis) e "BASED" (em contexto de marcas internacionais). A combinação "MÉTODO BASES" não possui nenhuma anterioridade nesta classe, configurando campo inteiramente livre para registro de materiais didáticos impressos associados à metodologia.</w:t>
+      </w:r>
+    </w:p>
+    <w:p>
+      <w:pPr>
+        <w:spacing w:after="240" w:line="360" w:lineRule="auto"/>
+        <w:ind w:firstLine="1701"/>
+        <w:jc w:val="both"/>
+      </w:pPr>
+      <w:r>
+        <w:rPr>
+          <w:rFonts w:ascii="Sora" w:hAnsi="Sora" w:eastAsia="Sora" w:cs="Sora"/>
+          <w:b w:val="0"/>
+          <w:caps w:val="0"/>
+          <w:color w:val="595959"/>
+          <w:sz w:val="24"/>
+          <w:u w:val="none"/>
+        </w:rPr>
+      </w:r>
+      <w:r>
+        <w:rPr>
+          <w:rFonts w:ascii="Sora" w:hAnsi="Sora" w:eastAsia="Sora" w:cs="Sora"/>
+          <w:b/>
+          <w:caps w:val="0"/>
+          <w:color w:val="595959"/>
+          <w:sz w:val="24"/>
+          <w:u w:val="none"/>
+        </w:rPr>
+        <w:t>Conclusão e estratégia de depósito</w:t>
+      </w:r>
+      <w:r>
+        <w:rPr>
+          <w:rFonts w:ascii="Sora" w:hAnsi="Sora" w:eastAsia="Sora" w:cs="Sora"/>
+          <w:b w:val="0"/>
+          <w:caps w:val="0"/>
+          <w:color w:val="595959"/>
+          <w:sz w:val="24"/>
+          <w:u w:val="none"/>
+        </w:rPr>
+      </w:r>
+    </w:p>
+    <w:p>
+      <w:pPr>
+        <w:spacing w:after="240" w:line="360" w:lineRule="auto"/>
+        <w:ind w:firstLine="1701"/>
+        <w:jc w:val="both"/>
+      </w:pPr>
+      <w:r>
+        <w:rPr>
+          <w:rFonts w:ascii="Sora" w:hAnsi="Sora" w:eastAsia="Sora" w:cs="Sora"/>
+          <w:b w:val="0"/>
+          <w:caps w:val="0"/>
+          <w:color w:val="595959"/>
+          <w:sz w:val="24"/>
+          <w:u w:val="none"/>
+        </w:rPr>
+        <w:t>A análise do universo de anterioridades conduz a prognóstico favorável para o registro de "Método Bases" nas três classes pretendidas, com ressalva específica para a Classe 41. Na Classe 41, a densidade marcária do elemento "BASES" é elevada: coexistem na mesma classe os sinais "BASES" puro (dois processos do mesmo titular), "INSTITUTO BASES", "Projeto BASES", "4 Bases", "AS TRÊS BASES", "AS CINCO BASES", "Bases Médicas", "BRECARD – Bases das Respostas às Emergências Cardiológicas", "BREVAR – Bases das Respostas às Emergências Ventilatórias", "BASE2 ENSINO", "BASE4 CROSS TRAINING", "ACADEMIA BASE1", "BASE7" e "Forrozão Tá nas Bases" — todos com diferentes titulares ou do mesmo titular com diferentes prefixos, todos coexistindo pacificamente. Essa multiplicidade é evidência irrefutável de que o INPI trata "BASES" como elemento de baixa distintividade intrínseca no campo educacional, exigindo que cada titular se diferencie por elemento adicional. O acréscimo de "Método" satisfaz plenamente essa exigência, conferindo ao conjunto identidade própria e distinta de todos os sinais existentes. A concessão de "4 Bases" com especificação em "metodologia de ensino" é precedente particularmente relevante. Recomenda-se redigir as especificações de forma precisa, concentrada no universo da psicologia — "supervisão clínica de profissionais de psicologia", "formação em metodologia psicológica aplicada", "ensino de técnicas de abordagem terapêutica" — evitando especificações genéricas de educação que maximizariam a sobreposição com os registros existentes de "BASES" puro. Na Classe 44, a viabilidade é PROVÁVEL: as anterioridades existentes ("Projeto Bases" e "Instituto Bases") coexistem harmonicamente, e o acréscimo "Método" confere distinção suficiente. Na Classe 16, a viabilidade é MUITO PROVÁVEL — campo inteiramente livre, sem anterioridades. O prognóstico consolidado é: Classe 41 — provável com estratégia de especificações; Classe 44 — provável; Classe 16 — muito provável.</w:t>
       </w:r>
     </w:p>
     <w:p>
@@ -909,6 +1313,40 @@
           <w:pPr>
             <w:jc w:val="left"/>
           </w:pPr>
+          <w:r>
+            <w:drawing>
+              <wp:inline xmlns:a="http://schemas.openxmlformats.org/drawingml/2006/main" xmlns:pic="http://schemas.openxmlformats.org/drawingml/2006/picture">
+                <wp:extent cx="2520000" cy="1575000"/>
+                <wp:docPr id="1" name="Picture 1"/>
+                <wp:cNvGraphicFramePr>
+                  <a:graphicFrameLocks noChangeAspect="1"/>
+                </wp:cNvGraphicFramePr>
+                <a:graphic>
+                  <a:graphicData uri="http://schemas.openxmlformats.org/drawingml/2006/picture">
+                    <pic:pic>
+                      <pic:nvPicPr>
+                        <pic:cNvPr id="0" name="logo-genesis.png"/>
+                        <pic:cNvPicPr/>
+                      </pic:nvPicPr>
+                      <pic:blipFill>
+                        <a:blip r:embed="rId1"/>
+                        <a:stretch>
+                          <a:fillRect/>
+                        </a:stretch>
+                      </pic:blipFill>
+                      <pic:spPr>
+                        <a:xfrm>
+                          <a:off x="0" y="0"/>
+                          <a:ext cx="2520000" cy="1575000"/>
+                        </a:xfrm>
+                        <a:prstGeom prst="rect"/>
+                      </pic:spPr>
+                    </pic:pic>
+                  </a:graphicData>
+                </a:graphic>
+              </wp:inline>
+            </w:drawing>
+          </w:r>
         </w:p>
       </w:tc>
       <w:tc>
@@ -957,6 +1395,40 @@
       <w:pStyle w:val="Header"/>
       <w:jc w:val="center"/>
     </w:pPr>
+    <w:r>
+      <w:drawing>
+        <wp:inline xmlns:a="http://schemas.openxmlformats.org/drawingml/2006/main" xmlns:pic="http://schemas.openxmlformats.org/drawingml/2006/picture">
+          <wp:extent cx="2160000" cy="1350000"/>
+          <wp:docPr id="1" name="Picture 1"/>
+          <wp:cNvGraphicFramePr>
+            <a:graphicFrameLocks noChangeAspect="1"/>
+          </wp:cNvGraphicFramePr>
+          <a:graphic>
+            <a:graphicData uri="http://schemas.openxmlformats.org/drawingml/2006/picture">
+              <pic:pic>
+                <pic:nvPicPr>
+                  <pic:cNvPr id="0" name="logo-genesis.png"/>
+                  <pic:cNvPicPr/>
+                </pic:nvPicPr>
+                <pic:blipFill>
+                  <a:blip r:embed="rId1"/>
+                  <a:stretch>
+                    <a:fillRect/>
+                  </a:stretch>
+                </pic:blipFill>
+                <pic:spPr>
+                  <a:xfrm>
+                    <a:off x="0" y="0"/>
+                    <a:ext cx="2160000" cy="1350000"/>
+                  </a:xfrm>
+                  <a:prstGeom prst="rect"/>
+                </pic:spPr>
+              </pic:pic>
+            </a:graphicData>
+          </a:graphic>
+        </wp:inline>
+      </w:drawing>
+    </w:r>
   </w:p>
 </w:hdr>
 </file>

</xml_diff>